<commit_message>
Update report with commit reference
Co-Authored-By: Claude Opus 5.5 <noreply@anthropic.com>
Claude-Session: https://claude.ai/code/session_011D8ZaBzhwCAJSpzAQT38fV
</commit_message>
<xml_diff>
--- a/Assignment2_Report.docx
+++ b/Assignment2_Report.docx
@@ -74,7 +74,7 @@
         <w:spacing w:after="120"/>
       </w:pPr>
       <w:r>
-        <w:t xml:space="preserve">All results come from one run of fault_tolerant_processor.py (commit 871f0e6, Python 3.11.15). Logs are in the output folder.</w:t>
+        <w:t xml:space="preserve">All results come from one run of fault_tolerant_processor.py (commit 0d8717c, Python 3.11.15). Logs are in the output folder.</w:t>
       </w:r>
     </w:p>
     <w:p>
@@ -10314,7 +10314,7 @@
                 <w:sz w:val="18"/>
                 <w:szCs w:val="18"/>
               </w:rPr>
-              <w:t xml:space="preserve">fault_tolerant_processor.py, https://github.com/MrZhorik09/Ass2, commit ________, logs: output/run_log.jsonl, output/attempt_log_partC.csv</w:t>
+              <w:t xml:space="preserve">fault_tolerant_processor.py, https://github.com/MrZhorik09/Ass2, commit 0d8717c, logs: output/run_log.jsonl, output/attempt_log_partC.csv</w:t>
             </w:r>
           </w:p>
         </w:tc>

</xml_diff>